<commit_message>
Read Leng & Yuan (2026, ISR): no overlap with our contribution; add read-notes, cite it in Section 2, switch reference list to ISR style
Co-Authored-By: Claude Sonnet 5.5 <noreply@anthropic.com>
Claude-Session: https://claude.ai/code/session_015MZUD2mugZGFJhoGnpeM66
</commit_message>
<xml_diff>
--- a/halluc/submission/ISR_manuscript.docx
+++ b/halluc/submission/ISR_manuscript.docx
@@ -191,7 +191,7 @@
         <w:t xml:space="preserve"> </w:t>
       </w:r>
       <w:r>
-        <w:t xml:space="preserve">Research on human–AI collaboration documents that delegating work to AI and reviewing its output involves cognitive challenges and can raise or lower performance depending on the task (Fügener et al. 2021, 2022; Dell’Acqua et al. 2023). The question of how much to verify has an older counterpart in the economics of costly state verification and auditing (Townsend 1979; Gale and Hellwig 1985; Border and Sobel 1987). We bring the second tradition to bear on the first, with the difference that the unit being verified is generated by a stochastic process rather than reported by a strategic agent (Section 8.1).</w:t>
+        <w:t xml:space="preserve">Research on human–AI collaboration documents that delegating work to AI and reviewing its output involves cognitive challenges and can raise or lower performance depending on the task (Fügener et al. 2021, 2022; Dell’Acqua et al. 2023). The question of how much to verify has an older counterpart in the economics of costly state verification and auditing (Townsend 1979; Gale and Hellwig 1985; Border and Sobel 1987). We bring the second tradition to bear on the first, with the difference that the unit being verified is generated by a stochastic process rather than reported by a strategic agent (Section 8.1). Closely related work audits the behavior of language models before deployment, linking a model’s stated reasoning to its final decisions in economic-game and delegation scenarios (Leng and Yuan 2026). We address a complementary problem: given a model whose outputs contain factual errors, where should scarce human verification go once the model is in use?</w:t>
       </w:r>
     </w:p>
     <w:p>
@@ -6335,7 +6335,7 @@
         <w:pStyle w:val="FirstParagraph"/>
       </w:pPr>
       <w:r>
-        <w:t xml:space="preserve">[AUTHORS: verify every entry against the original source and complete missing fields before submission.]</w:t>
+        <w:t xml:space="preserve">[AUTHORS: every entry must be verified against the original source. Format follows the pattern of reference lists in published ISR articles (surname and initials, year in parentheses, abbreviated journal names); the official INFORMS reference-style guide has not been read, so abbreviations may need adjustment.]</w:t>
       </w:r>
     </w:p>
     <w:p>
@@ -6343,20 +6343,23 @@
         <w:pStyle w:val="BodyText"/>
       </w:pPr>
       <w:r>
-        <w:t xml:space="preserve">Border, K. C., &amp; Sobel, J. (1987). Samurai accountant: A theory of auditing and plunder.</w:t>
-      </w:r>
-      <w:r>
-        <w:t xml:space="preserve"> </w:t>
-      </w:r>
-      <w:r>
-        <w:rPr>
-          <w:iCs/>
-          <w:i/>
-        </w:rPr>
-        <w:t xml:space="preserve">Review of Economic Studies, 54</w:t>
-      </w:r>
-      <w:r>
-        <w:t xml:space="preserve">(4), 525–540.</w:t>
+        <w:t xml:space="preserve">Border KC, Sobel J (1987) Samurai accountant: A theory of auditing and plunder.</w:t>
+      </w:r>
+      <w:r>
+        <w:t xml:space="preserve"> </w:t>
+      </w:r>
+      <w:r>
+        <w:rPr>
+          <w:iCs/>
+          <w:i/>
+        </w:rPr>
+        <w:t xml:space="preserve">Rev. Econom. Stud.</w:t>
+      </w:r>
+      <w:r>
+        <w:t xml:space="preserve"> </w:t>
+      </w:r>
+      <w:r>
+        <w:t xml:space="preserve">54(4):525–540.</w:t>
       </w:r>
     </w:p>
     <w:p>
@@ -6364,20 +6367,23 @@
         <w:pStyle w:val="BodyText"/>
       </w:pPr>
       <w:r>
-        <w:t xml:space="preserve">Buçinca, Z., Malaya, M. B., &amp; Gajos, K. Z. (2021). To trust or to think: Cognitive forcing functions can reduce overreliance on AI in AI-assisted decision-making.</w:t>
-      </w:r>
-      <w:r>
-        <w:t xml:space="preserve"> </w:t>
-      </w:r>
-      <w:r>
-        <w:rPr>
-          <w:iCs/>
-          <w:i/>
-        </w:rPr>
-        <w:t xml:space="preserve">Proceedings of the ACM on Human-Computer Interaction, 5</w:t>
-      </w:r>
-      <w:r>
-        <w:t xml:space="preserve">(CSCW1), Article 188.</w:t>
+        <w:t xml:space="preserve">Buçinca Z, Malaya MB, Gajos KZ (2021) To trust or to think: Cognitive forcing functions can reduce overreliance on AI in AI-assisted decision-making.</w:t>
+      </w:r>
+      <w:r>
+        <w:t xml:space="preserve"> </w:t>
+      </w:r>
+      <w:r>
+        <w:rPr>
+          <w:iCs/>
+          <w:i/>
+        </w:rPr>
+        <w:t xml:space="preserve">Proc. ACM Human-Comput. Interaction</w:t>
+      </w:r>
+      <w:r>
+        <w:t xml:space="preserve"> </w:t>
+      </w:r>
+      <w:r>
+        <w:t xml:space="preserve">5(CSCW1):Article 188.</w:t>
       </w:r>
     </w:p>
     <w:p>
@@ -6385,7 +6391,7 @@
         <w:pStyle w:val="BodyText"/>
       </w:pPr>
       <w:r>
-        <w:t xml:space="preserve">Catalini, C., Hui, X., &amp; Wu, J. (2026). Some simple economics of AGI. arXiv:2602.20946.</w:t>
+        <w:t xml:space="preserve">Catalini C, Hui X, Wu J (2026) Some simple economics of AGI. Preprint, arXiv:2602.20946. [AUTHORS: verify authors and status.]</w:t>
       </w:r>
     </w:p>
     <w:p>
@@ -6393,20 +6399,23 @@
         <w:pStyle w:val="BodyText"/>
       </w:pPr>
       <w:r>
-        <w:t xml:space="preserve">Cox, D. R. (1955). Some statistical methods connected with series of events.</w:t>
-      </w:r>
-      <w:r>
-        <w:t xml:space="preserve"> </w:t>
-      </w:r>
-      <w:r>
-        <w:rPr>
-          <w:iCs/>
-          <w:i/>
-        </w:rPr>
-        <w:t xml:space="preserve">Journal of the Royal Statistical Society: Series B, 17</w:t>
-      </w:r>
-      <w:r>
-        <w:t xml:space="preserve">(2), 129–164.</w:t>
+        <w:t xml:space="preserve">Cox DR (1955) Some statistical methods connected with series of events.</w:t>
+      </w:r>
+      <w:r>
+        <w:t xml:space="preserve"> </w:t>
+      </w:r>
+      <w:r>
+        <w:rPr>
+          <w:iCs/>
+          <w:i/>
+        </w:rPr>
+        <w:t xml:space="preserve">J. Roy. Statist. Soc. Ser. B</w:t>
+      </w:r>
+      <w:r>
+        <w:t xml:space="preserve"> </w:t>
+      </w:r>
+      <w:r>
+        <w:t xml:space="preserve">17(2):129–164.</w:t>
       </w:r>
     </w:p>
     <w:p>
@@ -6414,7 +6423,7 @@
         <w:pStyle w:val="BodyText"/>
       </w:pPr>
       <w:r>
-        <w:t xml:space="preserve">Dell’Acqua, F., McFowland III, E., Mollick, E. R., Lifshitz-Assaf, H., Kellogg, K., Rajendran, S., Krayer, L., Candelon, F., &amp; Lakhani, K. R. (2023). Navigating the jagged technological frontier: Field experimental evidence of the effects of AI on knowledge worker productivity and quality. Harvard Business School Working Paper No. 24-013.</w:t>
+        <w:t xml:space="preserve">Dell’Acqua F, McFowland E III, Mollick ER, Lifshitz-Assaf H, Kellogg K, Rajendran S, Krayer L, Candelon F, Lakhani KR (2023) Navigating the jagged technological frontier: Field experimental evidence of the effects of AI on knowledge worker productivity and quality. Working paper 24-013, Harvard Business School, Boston.</w:t>
       </w:r>
     </w:p>
     <w:p>
@@ -6422,20 +6431,23 @@
         <w:pStyle w:val="BodyText"/>
       </w:pPr>
       <w:r>
-        <w:t xml:space="preserve">Fügener, A., Grahl, J., Gupta, A., &amp; Ketter, W. (2022). Cognitive challenges in human–artificial intelligence collaboration: Investigating the path toward productive delegation.</w:t>
-      </w:r>
-      <w:r>
-        <w:t xml:space="preserve"> </w:t>
-      </w:r>
-      <w:r>
-        <w:rPr>
-          <w:iCs/>
-          <w:i/>
-        </w:rPr>
-        <w:t xml:space="preserve">Information Systems Research, 33</w:t>
-      </w:r>
-      <w:r>
-        <w:t xml:space="preserve">(2), 678–696.</w:t>
+        <w:t xml:space="preserve">Fügener A, Grahl J, Gupta A, Ketter W (2022) Cognitive challenges in human–artificial intelligence collaboration: Investigating the path toward productive delegation.</w:t>
+      </w:r>
+      <w:r>
+        <w:t xml:space="preserve"> </w:t>
+      </w:r>
+      <w:r>
+        <w:rPr>
+          <w:iCs/>
+          <w:i/>
+        </w:rPr>
+        <w:t xml:space="preserve">Inform. Systems Res.</w:t>
+      </w:r>
+      <w:r>
+        <w:t xml:space="preserve"> </w:t>
+      </w:r>
+      <w:r>
+        <w:t xml:space="preserve">33(2):678–696.</w:t>
       </w:r>
     </w:p>
     <w:p>
@@ -6443,20 +6455,23 @@
         <w:pStyle w:val="BodyText"/>
       </w:pPr>
       <w:r>
-        <w:t xml:space="preserve">Fügener, A., Grahl, J., Gupta, A., &amp; Ketter, W. (2021). Will humans-in-the-loop become borgs? Merits and pitfalls of working with AI.</w:t>
-      </w:r>
-      <w:r>
-        <w:t xml:space="preserve"> </w:t>
-      </w:r>
-      <w:r>
-        <w:rPr>
-          <w:iCs/>
-          <w:i/>
-        </w:rPr>
-        <w:t xml:space="preserve">MIS Quarterly, 45</w:t>
-      </w:r>
-      <w:r>
-        <w:t xml:space="preserve">(3), 1527–1556.</w:t>
+        <w:t xml:space="preserve">Fügener A, Grahl J, Gupta A, Ketter W (2021) Will humans-in-the-loop become borgs? Merits and pitfalls of working with AI.</w:t>
+      </w:r>
+      <w:r>
+        <w:t xml:space="preserve"> </w:t>
+      </w:r>
+      <w:r>
+        <w:rPr>
+          <w:iCs/>
+          <w:i/>
+        </w:rPr>
+        <w:t xml:space="preserve">MIS Quart.</w:t>
+      </w:r>
+      <w:r>
+        <w:t xml:space="preserve"> </w:t>
+      </w:r>
+      <w:r>
+        <w:t xml:space="preserve">45(3):1527–1556.</w:t>
       </w:r>
     </w:p>
     <w:p>
@@ -6464,20 +6479,23 @@
         <w:pStyle w:val="BodyText"/>
       </w:pPr>
       <w:r>
-        <w:t xml:space="preserve">Gale, D., &amp; Hellwig, M. (1985). Incentive-compatible debt contracts: The one-period problem.</w:t>
-      </w:r>
-      <w:r>
-        <w:t xml:space="preserve"> </w:t>
-      </w:r>
-      <w:r>
-        <w:rPr>
-          <w:iCs/>
-          <w:i/>
-        </w:rPr>
-        <w:t xml:space="preserve">Review of Economic Studies, 52</w:t>
-      </w:r>
-      <w:r>
-        <w:t xml:space="preserve">(4), 647–663.</w:t>
+        <w:t xml:space="preserve">Gale D, Hellwig M (1985) Incentive-compatible debt contracts: The one-period problem.</w:t>
+      </w:r>
+      <w:r>
+        <w:t xml:space="preserve"> </w:t>
+      </w:r>
+      <w:r>
+        <w:rPr>
+          <w:iCs/>
+          <w:i/>
+        </w:rPr>
+        <w:t xml:space="preserve">Rev. Econom. Stud.</w:t>
+      </w:r>
+      <w:r>
+        <w:t xml:space="preserve"> </w:t>
+      </w:r>
+      <w:r>
+        <w:t xml:space="preserve">52(4):647–663.</w:t>
       </w:r>
     </w:p>
     <w:p>
@@ -6485,20 +6503,23 @@
         <w:pStyle w:val="BodyText"/>
       </w:pPr>
       <w:r>
-        <w:t xml:space="preserve">Goel, A. L., &amp; Okumoto, K. (1979). Time-dependent error-detection rate model for software reliability and other performance measures.</w:t>
-      </w:r>
-      <w:r>
-        <w:t xml:space="preserve"> </w:t>
-      </w:r>
-      <w:r>
-        <w:rPr>
-          <w:iCs/>
-          <w:i/>
-        </w:rPr>
-        <w:t xml:space="preserve">IEEE Transactions on Reliability, R-28</w:t>
-      </w:r>
-      <w:r>
-        <w:t xml:space="preserve">(3), 206–211.</w:t>
+        <w:t xml:space="preserve">Goel AL, Okumoto K (1979) Time-dependent error-detection rate model for software reliability and other performance measures.</w:t>
+      </w:r>
+      <w:r>
+        <w:t xml:space="preserve"> </w:t>
+      </w:r>
+      <w:r>
+        <w:rPr>
+          <w:iCs/>
+          <w:i/>
+        </w:rPr>
+        <w:t xml:space="preserve">IEEE Trans. Reliability</w:t>
+      </w:r>
+      <w:r>
+        <w:t xml:space="preserve"> </w:t>
+      </w:r>
+      <w:r>
+        <w:t xml:space="preserve">R-28(3):206–211.</w:t>
       </w:r>
     </w:p>
     <w:p>
@@ -6506,20 +6527,23 @@
         <w:pStyle w:val="BodyText"/>
       </w:pPr>
       <w:r>
-        <w:t xml:space="preserve">Goodhue, D. L., &amp; Thompson, R. L. (1995). Task-technology fit and individual performance.</w:t>
-      </w:r>
-      <w:r>
-        <w:t xml:space="preserve"> </w:t>
-      </w:r>
-      <w:r>
-        <w:rPr>
-          <w:iCs/>
-          <w:i/>
-        </w:rPr>
-        <w:t xml:space="preserve">MIS Quarterly, 19</w:t>
-      </w:r>
-      <w:r>
-        <w:t xml:space="preserve">(2), 213–236.</w:t>
+        <w:t xml:space="preserve">Goodhue DL, Thompson RL (1995) Task-technology fit and individual performance.</w:t>
+      </w:r>
+      <w:r>
+        <w:t xml:space="preserve"> </w:t>
+      </w:r>
+      <w:r>
+        <w:rPr>
+          <w:iCs/>
+          <w:i/>
+        </w:rPr>
+        <w:t xml:space="preserve">MIS Quart.</w:t>
+      </w:r>
+      <w:r>
+        <w:t xml:space="preserve"> </w:t>
+      </w:r>
+      <w:r>
+        <w:t xml:space="preserve">19(2):213–236.</w:t>
       </w:r>
     </w:p>
     <w:p>
@@ -6527,20 +6551,23 @@
         <w:pStyle w:val="BodyText"/>
       </w:pPr>
       <w:r>
-        <w:t xml:space="preserve">Hawkes, A. G. (1971). Spectra of some self-exciting and mutually exciting point processes.</w:t>
-      </w:r>
-      <w:r>
-        <w:t xml:space="preserve"> </w:t>
-      </w:r>
-      <w:r>
-        <w:rPr>
-          <w:iCs/>
-          <w:i/>
-        </w:rPr>
-        <w:t xml:space="preserve">Biometrika, 58</w:t>
-      </w:r>
-      <w:r>
-        <w:t xml:space="preserve">(1), 83–90.</w:t>
+        <w:t xml:space="preserve">Hawkes AG (1971) Spectra of some self-exciting and mutually exciting point processes.</w:t>
+      </w:r>
+      <w:r>
+        <w:t xml:space="preserve"> </w:t>
+      </w:r>
+      <w:r>
+        <w:rPr>
+          <w:iCs/>
+          <w:i/>
+        </w:rPr>
+        <w:t xml:space="preserve">Biometrika</w:t>
+      </w:r>
+      <w:r>
+        <w:t xml:space="preserve"> </w:t>
+      </w:r>
+      <w:r>
+        <w:t xml:space="preserve">58(1):83–90.</w:t>
       </w:r>
     </w:p>
     <w:p>
@@ -6548,20 +6575,23 @@
         <w:pStyle w:val="BodyText"/>
       </w:pPr>
       <w:r>
-        <w:t xml:space="preserve">Ji, Z., Lee, N., Frieske, R., Yu, T., Su, D., Xu, Y., Ishii, E., Bang, Y. J., Madotto, A., &amp; Fung, P. (2023). Survey of hallucination in natural language generation.</w:t>
-      </w:r>
-      <w:r>
-        <w:t xml:space="preserve"> </w:t>
-      </w:r>
-      <w:r>
-        <w:rPr>
-          <w:iCs/>
-          <w:i/>
-        </w:rPr>
-        <w:t xml:space="preserve">ACM Computing Surveys, 55</w:t>
-      </w:r>
-      <w:r>
-        <w:t xml:space="preserve">(12), Article 248.</w:t>
+        <w:t xml:space="preserve">Ji Z, Lee N, Frieske R, Yu T, Su D, Xu Y, Ishii E, Bang YJ, Madotto A, Fung P (2023) Survey of hallucination in natural language generation.</w:t>
+      </w:r>
+      <w:r>
+        <w:t xml:space="preserve"> </w:t>
+      </w:r>
+      <w:r>
+        <w:rPr>
+          <w:iCs/>
+          <w:i/>
+        </w:rPr>
+        <w:t xml:space="preserve">ACM Comput. Surveys</w:t>
+      </w:r>
+      <w:r>
+        <w:t xml:space="preserve"> </w:t>
+      </w:r>
+      <w:r>
+        <w:t xml:space="preserve">55(12):Article 248.</w:t>
       </w:r>
     </w:p>
     <w:p>
@@ -6569,20 +6599,23 @@
         <w:pStyle w:val="BodyText"/>
       </w:pPr>
       <w:r>
-        <w:t xml:space="preserve">Manakul, P., Liusie, A., &amp; Gales, M. J. F. (2023). SelfCheckGPT: Zero-resource black-box hallucination detection for generative large language models.</w:t>
-      </w:r>
-      <w:r>
-        <w:t xml:space="preserve"> </w:t>
-      </w:r>
-      <w:r>
-        <w:rPr>
-          <w:iCs/>
-          <w:i/>
-        </w:rPr>
-        <w:t xml:space="preserve">Proceedings of EMNLP 2023</w:t>
-      </w:r>
-      <w:r>
-        <w:t xml:space="preserve">.</w:t>
+        <w:t xml:space="preserve">Leng Y, Yuan Y (2026) SUVA: A probabilistic framework for auditing LLMs with an application to social preferences.</w:t>
+      </w:r>
+      <w:r>
+        <w:t xml:space="preserve"> </w:t>
+      </w:r>
+      <w:r>
+        <w:rPr>
+          <w:iCs/>
+          <w:i/>
+        </w:rPr>
+        <w:t xml:space="preserve">Inform. Systems Res.</w:t>
+      </w:r>
+      <w:r>
+        <w:t xml:space="preserve"> </w:t>
+      </w:r>
+      <w:r>
+        <w:t xml:space="preserve">37(3):1805–1830.</w:t>
       </w:r>
     </w:p>
     <w:p>
@@ -6590,23 +6623,23 @@
         <w:pStyle w:val="BodyText"/>
       </w:pPr>
       <w:r>
-        <w:t xml:space="preserve">Marshall, A. W., Olkin, I., &amp; Arnold, B. C. (2011).</w:t>
-      </w:r>
-      <w:r>
-        <w:t xml:space="preserve"> </w:t>
-      </w:r>
-      <w:r>
-        <w:rPr>
-          <w:iCs/>
-          <w:i/>
-        </w:rPr>
-        <w:t xml:space="preserve">Inequalities: Theory of majorization and its applications</w:t>
-      </w:r>
-      <w:r>
-        <w:t xml:space="preserve"> </w:t>
-      </w:r>
-      <w:r>
-        <w:t xml:space="preserve">(2nd ed.). Springer.</w:t>
+        <w:t xml:space="preserve">Manakul P, Liusie A, Gales MJF (2023) SelfCheckGPT: Zero-resource black-box hallucination detection for generative large language models.</w:t>
+      </w:r>
+      <w:r>
+        <w:t xml:space="preserve"> </w:t>
+      </w:r>
+      <w:r>
+        <w:rPr>
+          <w:iCs/>
+          <w:i/>
+        </w:rPr>
+        <w:t xml:space="preserve">Proc. 2023 Conf. Empirical Methods Natural Language Processing</w:t>
+      </w:r>
+      <w:r>
+        <w:t xml:space="preserve"> </w:t>
+      </w:r>
+      <w:r>
+        <w:t xml:space="preserve">(Association for Computational Linguistics).</w:t>
       </w:r>
     </w:p>
     <w:p>
@@ -6614,20 +6647,20 @@
         <w:pStyle w:val="BodyText"/>
       </w:pPr>
       <w:r>
-        <w:t xml:space="preserve">Min, S., Krishna, K., Lyu, X., Lewis, M., Yih, W., Koh, P. W., Iyyer, M., Zettlemoyer, L., &amp; Hajishirzi, H. (2023). FActScore: Fine-grained atomic evaluation of factual precision in long form text generation.</w:t>
-      </w:r>
-      <w:r>
-        <w:t xml:space="preserve"> </w:t>
-      </w:r>
-      <w:r>
-        <w:rPr>
-          <w:iCs/>
-          <w:i/>
-        </w:rPr>
-        <w:t xml:space="preserve">Proceedings of EMNLP 2023</w:t>
-      </w:r>
-      <w:r>
-        <w:t xml:space="preserve">. arXiv:2305.14251.</w:t>
+        <w:t xml:space="preserve">Marshall AW, Olkin I, Arnold BC (2011)</w:t>
+      </w:r>
+      <w:r>
+        <w:t xml:space="preserve"> </w:t>
+      </w:r>
+      <w:r>
+        <w:rPr>
+          <w:iCs/>
+          <w:i/>
+        </w:rPr>
+        <w:t xml:space="preserve">Inequalities: Theory of Majorization and Its Applications</w:t>
+      </w:r>
+      <w:r>
+        <w:t xml:space="preserve">, 2nd ed. (Springer, New York).</w:t>
       </w:r>
     </w:p>
     <w:p>
@@ -6635,23 +6668,23 @@
         <w:pStyle w:val="BodyText"/>
       </w:pPr>
       <w:r>
-        <w:t xml:space="preserve">Mitchell, M., Wu, S., Zaldivar, A., Barnes, P., Vasserman, L., Hutchinson, B., Spitzer, E., Raji, I. D., &amp; Gebru, T. (2019). Model cards for model reporting.</w:t>
-      </w:r>
-      <w:r>
-        <w:t xml:space="preserve"> </w:t>
-      </w:r>
-      <w:r>
-        <w:rPr>
-          <w:iCs/>
-          <w:i/>
-        </w:rPr>
-        <w:t xml:space="preserve">Proceedings of the Conference on Fairness, Accountability, and Transparency</w:t>
-      </w:r>
-      <w:r>
-        <w:t xml:space="preserve"> </w:t>
-      </w:r>
-      <w:r>
-        <w:t xml:space="preserve">(FAT* ’19), 220–229.</w:t>
+        <w:t xml:space="preserve">Min S, Krishna K, Lyu X, Lewis M, Yih W, Koh PW, Iyyer M, Zettlemoyer L, Hajishirzi H (2023) FActScore: Fine-grained atomic evaluation of factual precision in long form text generation.</w:t>
+      </w:r>
+      <w:r>
+        <w:t xml:space="preserve"> </w:t>
+      </w:r>
+      <w:r>
+        <w:rPr>
+          <w:iCs/>
+          <w:i/>
+        </w:rPr>
+        <w:t xml:space="preserve">Proc. 2023 Conf. Empirical Methods Natural Language Processing</w:t>
+      </w:r>
+      <w:r>
+        <w:t xml:space="preserve"> </w:t>
+      </w:r>
+      <w:r>
+        <w:t xml:space="preserve">(Association for Computational Linguistics).</w:t>
       </w:r>
     </w:p>
     <w:p>
@@ -6659,20 +6692,23 @@
         <w:pStyle w:val="BodyText"/>
       </w:pPr>
       <w:r>
-        <w:t xml:space="preserve">Niu, C., Wu, Y., Zhu, J., Xu, S., Shum, K., Zhong, R., Song, J., &amp; Zhang, T. (2024). RAGTruth: A hallucination corpus for developing trustworthy retrieval-augmented language models.</w:t>
-      </w:r>
-      <w:r>
-        <w:t xml:space="preserve"> </w:t>
-      </w:r>
-      <w:r>
-        <w:rPr>
-          <w:iCs/>
-          <w:i/>
-        </w:rPr>
-        <w:t xml:space="preserve">Proceedings of ACL 2024</w:t>
-      </w:r>
-      <w:r>
-        <w:t xml:space="preserve">. arXiv:2401.00396.</w:t>
+        <w:t xml:space="preserve">Mitchell M, Wu S, Zaldivar A, Barnes P, Vasserman L, Hutchinson B, Spitzer E, Raji ID, Gebru T (2019) Model cards for model reporting.</w:t>
+      </w:r>
+      <w:r>
+        <w:t xml:space="preserve"> </w:t>
+      </w:r>
+      <w:r>
+        <w:rPr>
+          <w:iCs/>
+          <w:i/>
+        </w:rPr>
+        <w:t xml:space="preserve">Proc. Conf. Fairness, Accountability, Transparency</w:t>
+      </w:r>
+      <w:r>
+        <w:t xml:space="preserve"> </w:t>
+      </w:r>
+      <w:r>
+        <w:t xml:space="preserve">(ACM, New York), 220–229.</w:t>
       </w:r>
     </w:p>
     <w:p>
@@ -6680,20 +6716,23 @@
         <w:pStyle w:val="BodyText"/>
       </w:pPr>
       <w:r>
-        <w:t xml:space="preserve">Parasuraman, R., &amp; Manzey, D. H. (2010). Complacency and bias in human use of automation: An attentional integration.</w:t>
-      </w:r>
-      <w:r>
-        <w:t xml:space="preserve"> </w:t>
-      </w:r>
-      <w:r>
-        <w:rPr>
-          <w:iCs/>
-          <w:i/>
-        </w:rPr>
-        <w:t xml:space="preserve">Human Factors, 52</w:t>
-      </w:r>
-      <w:r>
-        <w:t xml:space="preserve">(3), 381–410.</w:t>
+        <w:t xml:space="preserve">Niu C, Wu Y, Zhu J, Xu S, Shum K, Zhong R, Song J, Zhang T (2024) RAGTruth: A hallucination corpus for developing trustworthy retrieval-augmented language models.</w:t>
+      </w:r>
+      <w:r>
+        <w:t xml:space="preserve"> </w:t>
+      </w:r>
+      <w:r>
+        <w:rPr>
+          <w:iCs/>
+          <w:i/>
+        </w:rPr>
+        <w:t xml:space="preserve">Proc. 62nd Annual Meeting Assoc. Comput. Linguistics</w:t>
+      </w:r>
+      <w:r>
+        <w:t xml:space="preserve"> </w:t>
+      </w:r>
+      <w:r>
+        <w:t xml:space="preserve">(Association for Computational Linguistics).</w:t>
       </w:r>
     </w:p>
     <w:p>
@@ -6701,20 +6740,23 @@
         <w:pStyle w:val="BodyText"/>
       </w:pPr>
       <w:r>
-        <w:t xml:space="preserve">Si, C., et al. (2024). Large language models help humans verify truthfulness—except when they are convincingly wrong.</w:t>
-      </w:r>
-      <w:r>
-        <w:t xml:space="preserve"> </w:t>
-      </w:r>
-      <w:r>
-        <w:rPr>
-          <w:iCs/>
-          <w:i/>
-        </w:rPr>
-        <w:t xml:space="preserve">Proceedings of NAACL 2024</w:t>
-      </w:r>
-      <w:r>
-        <w:t xml:space="preserve">. arXiv:2310.12558. [AUTHORS: complete author list and venue.]</w:t>
+        <w:t xml:space="preserve">Parasuraman R, Manzey DH (2010) Complacency and bias in human use of automation: An attentional integration.</w:t>
+      </w:r>
+      <w:r>
+        <w:t xml:space="preserve"> </w:t>
+      </w:r>
+      <w:r>
+        <w:rPr>
+          <w:iCs/>
+          <w:i/>
+        </w:rPr>
+        <w:t xml:space="preserve">Human Factors</w:t>
+      </w:r>
+      <w:r>
+        <w:t xml:space="preserve"> </w:t>
+      </w:r>
+      <w:r>
+        <w:t xml:space="preserve">52(3):381–410.</w:t>
       </w:r>
     </w:p>
     <w:p>
@@ -6722,20 +6764,23 @@
         <w:pStyle w:val="BodyText"/>
       </w:pPr>
       <w:r>
-        <w:t xml:space="preserve">Townsend, R. M. (1979). Optimal contracts and competitive markets with costly state verification.</w:t>
-      </w:r>
-      <w:r>
-        <w:t xml:space="preserve"> </w:t>
-      </w:r>
-      <w:r>
-        <w:rPr>
-          <w:iCs/>
-          <w:i/>
-        </w:rPr>
-        <w:t xml:space="preserve">Journal of Economic Theory, 21</w:t>
-      </w:r>
-      <w:r>
-        <w:t xml:space="preserve">(2), 265–293.</w:t>
+        <w:t xml:space="preserve">Si C, et al. (2024) Large language models help humans verify truthfulness—except when they are convincingly wrong.</w:t>
+      </w:r>
+      <w:r>
+        <w:t xml:space="preserve"> </w:t>
+      </w:r>
+      <w:r>
+        <w:rPr>
+          <w:iCs/>
+          <w:i/>
+        </w:rPr>
+        <w:t xml:space="preserve">Proc. 2024 Conf. North Amer. Chapter Assoc. Comput. Linguistics</w:t>
+      </w:r>
+      <w:r>
+        <w:t xml:space="preserve"> </w:t>
+      </w:r>
+      <w:r>
+        <w:t xml:space="preserve">(Association for Computational Linguistics). arXiv:2310.12558. [AUTHORS: complete author list and venue.]</w:t>
       </w:r>
     </w:p>
     <w:p>
@@ -6743,17 +6788,41 @@
         <w:pStyle w:val="BodyText"/>
       </w:pPr>
       <w:r>
-        <w:t xml:space="preserve">Tu, et al. (2025). Investigating factuality in long-form text generation: The roles of self-known and self-unknown.</w:t>
-      </w:r>
-      <w:r>
-        <w:t xml:space="preserve"> </w:t>
-      </w:r>
-      <w:r>
-        <w:rPr>
-          <w:iCs/>
-          <w:i/>
-        </w:rPr>
-        <w:t xml:space="preserve">Proceedings of EMNLP 2025</w:t>
+        <w:t xml:space="preserve">Townsend RM (1979) Optimal contracts and competitive markets with costly state verification.</w:t>
+      </w:r>
+      <w:r>
+        <w:t xml:space="preserve"> </w:t>
+      </w:r>
+      <w:r>
+        <w:rPr>
+          <w:iCs/>
+          <w:i/>
+        </w:rPr>
+        <w:t xml:space="preserve">J. Econom. Theory</w:t>
+      </w:r>
+      <w:r>
+        <w:t xml:space="preserve"> </w:t>
+      </w:r>
+      <w:r>
+        <w:t xml:space="preserve">21(2):265–293.</w:t>
+      </w:r>
+    </w:p>
+    <w:p>
+      <w:pPr>
+        <w:pStyle w:val="BodyText"/>
+      </w:pPr>
+      <w:r>
+        <w:t xml:space="preserve">Tu, et al. (2025) Investigating factuality in long-form text generation: The roles of self-known and self-unknown.</w:t>
+      </w:r>
+      <w:r>
+        <w:t xml:space="preserve"> </w:t>
+      </w:r>
+      <w:r>
+        <w:rPr>
+          <w:iCs/>
+          <w:i/>
+        </w:rPr>
+        <w:t xml:space="preserve">Proc. 2025 Conf. Empirical Methods Natural Language Processing</w:t>
       </w:r>
       <w:r>
         <w:t xml:space="preserve">. arXiv:2411.15993. [AUTHORS: complete author list.]</w:t>
@@ -6764,20 +6833,23 @@
         <w:pStyle w:val="BodyText"/>
       </w:pPr>
       <w:r>
-        <w:t xml:space="preserve">Vasconcelos, H., Jörke, M., Grunde-McLaughlin, M., Gerstenberg, T., Bernstein, M. S., &amp; Krishna, R. (2023). Explanations can reduce overreliance on AI systems during decision-making.</w:t>
-      </w:r>
-      <w:r>
-        <w:t xml:space="preserve"> </w:t>
-      </w:r>
-      <w:r>
-        <w:rPr>
-          <w:iCs/>
-          <w:i/>
-        </w:rPr>
-        <w:t xml:space="preserve">Proceedings of the ACM on Human-Computer Interaction, 7</w:t>
-      </w:r>
-      <w:r>
-        <w:t xml:space="preserve">(CSCW1), Article 129.</w:t>
+        <w:t xml:space="preserve">Vasconcelos H, Jörke M, Grunde-McLaughlin M, Gerstenberg T, Bernstein MS, Krishna R (2023) Explanations can reduce overreliance on AI systems during decision-making.</w:t>
+      </w:r>
+      <w:r>
+        <w:t xml:space="preserve"> </w:t>
+      </w:r>
+      <w:r>
+        <w:rPr>
+          <w:iCs/>
+          <w:i/>
+        </w:rPr>
+        <w:t xml:space="preserve">Proc. ACM Human-Comput. Interaction</w:t>
+      </w:r>
+      <w:r>
+        <w:t xml:space="preserve"> </w:t>
+      </w:r>
+      <w:r>
+        <w:t xml:space="preserve">7(CSCW1):Article 129.</w:t>
       </w:r>
     </w:p>
     <w:p>
@@ -6785,20 +6857,20 @@
         <w:pStyle w:val="BodyText"/>
       </w:pPr>
       <w:r>
-        <w:t xml:space="preserve">Wei, J., et al. (2024). Long-form factuality in large language models.</w:t>
-      </w:r>
-      <w:r>
-        <w:t xml:space="preserve"> </w:t>
-      </w:r>
-      <w:r>
-        <w:rPr>
-          <w:iCs/>
-          <w:i/>
-        </w:rPr>
-        <w:t xml:space="preserve">Advances in Neural Information Processing Systems, 37</w:t>
-      </w:r>
-      <w:r>
-        <w:t xml:space="preserve">. arXiv:2403.18802. [AUTHORS: complete author list.]</w:t>
+        <w:t xml:space="preserve">Wei J, et al. (2024) Long-form factuality in large language models.</w:t>
+      </w:r>
+      <w:r>
+        <w:t xml:space="preserve"> </w:t>
+      </w:r>
+      <w:r>
+        <w:rPr>
+          <w:iCs/>
+          <w:i/>
+        </w:rPr>
+        <w:t xml:space="preserve">Adv. Neural Inform. Processing Systems</w:t>
+      </w:r>
+      <w:r>
+        <w:t xml:space="preserve">, vol. 37. arXiv:2403.18802. [AUTHORS: complete author list.]</w:t>
       </w:r>
     </w:p>
     <w:p>
@@ -6806,7 +6878,7 @@
         <w:pStyle w:val="BodyText"/>
       </w:pPr>
       <w:r>
-        <w:t xml:space="preserve">Yang, et al. (2025). Hallucinate at the last in long response generation: A case study on long document summarization. arXiv:2505.15291. [AUTHORS: complete author list and venue.]</w:t>
+        <w:t xml:space="preserve">Yang, et al. (2025) Hallucinate at the last in long response generation: A case study on long document summarization. Preprint, arXiv:2505.15291. [AUTHORS: complete author list and venue.]</w:t>
       </w:r>
     </w:p>
     <w:p>
@@ -6814,20 +6886,23 @@
         <w:pStyle w:val="BodyText"/>
       </w:pPr>
       <w:r>
-        <w:t xml:space="preserve">Zhang, M., Press, O., Merrill, W., Liu, A., &amp; Smith, N. A. (2024). How language model hallucinations can snowball.</w:t>
-      </w:r>
-      <w:r>
-        <w:t xml:space="preserve"> </w:t>
-      </w:r>
-      <w:r>
-        <w:rPr>
-          <w:iCs/>
-          <w:i/>
-        </w:rPr>
-        <w:t xml:space="preserve">Proceedings of ICML 2024</w:t>
-      </w:r>
-      <w:r>
-        <w:t xml:space="preserve">. arXiv:2305.13534.</w:t>
+        <w:t xml:space="preserve">Zhang M, Press O, Merrill W, Liu A, Smith NA (2024) How language model hallucinations can snowball.</w:t>
+      </w:r>
+      <w:r>
+        <w:t xml:space="preserve"> </w:t>
+      </w:r>
+      <w:r>
+        <w:rPr>
+          <w:iCs/>
+          <w:i/>
+        </w:rPr>
+        <w:t xml:space="preserve">Proc. 41st Internat. Conf. Machine Learn.</w:t>
+      </w:r>
+      <w:r>
+        <w:t xml:space="preserve"> </w:t>
+      </w:r>
+      <w:r>
+        <w:t xml:space="preserve">(PMLR).</w:t>
       </w:r>
     </w:p>
     <w:bookmarkEnd w:id="52"/>

</xml_diff>

<commit_message>
Order same-author references chronologically
Co-Authored-By: Claude Sonnet 5.5 <noreply@anthropic.com>
Claude-Session: https://claude.ai/code/session_015MZUD2mugZGFJhoGnpeM66
</commit_message>
<xml_diff>
--- a/halluc/submission/ISR_manuscript.docx
+++ b/halluc/submission/ISR_manuscript.docx
@@ -6431,6 +6431,30 @@
         <w:pStyle w:val="BodyText"/>
       </w:pPr>
       <w:r>
+        <w:t xml:space="preserve">Fügener A, Grahl J, Gupta A, Ketter W (2021) Will humans-in-the-loop become borgs? Merits and pitfalls of working with AI.</w:t>
+      </w:r>
+      <w:r>
+        <w:t xml:space="preserve"> </w:t>
+      </w:r>
+      <w:r>
+        <w:rPr>
+          <w:iCs/>
+          <w:i/>
+        </w:rPr>
+        <w:t xml:space="preserve">MIS Quart.</w:t>
+      </w:r>
+      <w:r>
+        <w:t xml:space="preserve"> </w:t>
+      </w:r>
+      <w:r>
+        <w:t xml:space="preserve">45(3):1527–1556.</w:t>
+      </w:r>
+    </w:p>
+    <w:p>
+      <w:pPr>
+        <w:pStyle w:val="BodyText"/>
+      </w:pPr>
+      <w:r>
         <w:t xml:space="preserve">Fügener A, Grahl J, Gupta A, Ketter W (2022) Cognitive challenges in human–artificial intelligence collaboration: Investigating the path toward productive delegation.</w:t>
       </w:r>
       <w:r>
@@ -6448,30 +6472,6 @@
       </w:r>
       <w:r>
         <w:t xml:space="preserve">33(2):678–696.</w:t>
-      </w:r>
-    </w:p>
-    <w:p>
-      <w:pPr>
-        <w:pStyle w:val="BodyText"/>
-      </w:pPr>
-      <w:r>
-        <w:t xml:space="preserve">Fügener A, Grahl J, Gupta A, Ketter W (2021) Will humans-in-the-loop become borgs? Merits and pitfalls of working with AI.</w:t>
-      </w:r>
-      <w:r>
-        <w:t xml:space="preserve"> </w:t>
-      </w:r>
-      <w:r>
-        <w:rPr>
-          <w:iCs/>
-          <w:i/>
-        </w:rPr>
-        <w:t xml:space="preserve">MIS Quart.</w:t>
-      </w:r>
-      <w:r>
-        <w:t xml:space="preserve"> </w:t>
-      </w:r>
-      <w:r>
-        <w:t xml:space="preserve">45(3):1527–1556.</w:t>
       </w:r>
     </w:p>
     <w:p>

</xml_diff>

<commit_message>
Read Bouayad, Padmanabhan & Chari (2019, ISR): audit selection with deterrence; cite in Sections 2 and 8.1, add read-notes and reference
Co-Authored-By: Claude Sonnet 5.5 <noreply@anthropic.com>
Claude-Session: https://claude.ai/code/session_015MZUD2mugZGFJhoGnpeM66
</commit_message>
<xml_diff>
--- a/halluc/submission/ISR_manuscript.docx
+++ b/halluc/submission/ISR_manuscript.docx
@@ -191,7 +191,7 @@
         <w:t xml:space="preserve"> </w:t>
       </w:r>
       <w:r>
-        <w:t xml:space="preserve">Research on human–AI collaboration documents that delegating work to AI and reviewing its output involves cognitive challenges and can raise or lower performance depending on the task (Fügener et al. 2021, 2022; Dell’Acqua et al. 2023). The question of how much to verify has an older counterpart in the economics of costly state verification and auditing (Townsend 1979; Gale and Hellwig 1985; Border and Sobel 1987). We bring the second tradition to bear on the first, with the difference that the unit being verified is generated by a stochastic process rather than reported by a strategic agent (Section 8.1). Closely related work audits the behavior of language models before deployment, linking a model’s stated reasoning to its final decisions in economic-game and delegation scenarios (Leng and Yuan 2026). We address a complementary problem: given a model whose outputs contain factual errors, where should scarce human verification go once the model is in use?</w:t>
+        <w:t xml:space="preserve">Research on human–AI collaboration documents that delegating work to AI and reviewing its output involves cognitive challenges and can raise or lower performance depending on the task (Fügener et al. 2021, 2022; Dell’Acqua et al. 2023). The question of how much to verify has an older counterpart in the economics of costly state verification and auditing (Townsend 1979; Gale and Hellwig 1985; Border and Sobel 1987). We bring the second tradition to bear on the first, with the difference that the unit being verified is generated by a stochastic process rather than reported by a strategic agent (Section 8.1). Closely related work audits the behavior of language models before deployment, linking a model’s stated reasoning to its final decisions in economic-game and delegation scenarios (Leng and Yuan 2026). We address a complementary problem: given a model whose outputs contain factual errors, where should scarce human verification go once the model is in use? Audit selection has also been studied as an algorithm-design problem in information systems research: scoring models rank providers or claims by suspicion, and when audited parties respond, the objective is extended to include the deterrence that an audit produces (Bouayad et al. 2019). Our setting has the scoring but, absent retraining on audit outcomes, not the deterrence, because the verified content is produced by a model that does not respond to being checked.</w:t>
       </w:r>
     </w:p>
     <w:p>
@@ -5765,7 +5765,7 @@
         <w:pStyle w:val="FirstParagraph"/>
       </w:pPr>
       <w:r>
-        <w:t xml:space="preserve">Generative AI changes where the cost of producing information lies. The marginal cost of a draft approaches zero, while the cost of establishing that the draft is correct remains with people. The decision studied here, how much of an output to check and which parts, is therefore a management problem that recurs in every deployment, and the budget for checking is a control variable much like an audit budget. The structure of our problem resembles classical theories of costly state verification and auditing (Townsend 1979; Gale and Hellwig 1985; Border and Sobel 1987), in which a principal can observe the true state only by paying to verify it. There is one difference that matters for the form of the optimal policy. In those theories the verified party reports strategically, so optimal verification is typically stochastic and exists to deter misreporting. A language model does not respond strategically to being checked. Its errors arise from a random process whose intensity the organization can estimate, and the optimal policy is a deterministic threshold rule (Proposition 4) rather than a randomized audit. This is both a simplification and a boundary: if users could adapt prompts or workflows in response to known verification practices, the strategic elements of the audit literature would re-enter.</w:t>
+        <w:t xml:space="preserve">Generative AI changes where the cost of producing information lies. The marginal cost of a draft approaches zero, while the cost of establishing that the draft is correct remains with people. The decision studied here, how much of an output to check and which parts, is therefore a management problem that recurs in every deployment, and the budget for checking is a control variable much like an audit budget. The structure of our problem resembles classical theories of costly state verification and auditing (Townsend 1979; Gale and Hellwig 1985; Border and Sobel 1987), in which a principal can observe the true state only by paying to verify it. There is one difference that matters for the form of the optimal policy. In those theories the verified party reports strategically, so optimal verification is typically stochastic and exists to deter misreporting. A language model does not respond strategically to being checked. Its errors arise from a random process whose intensity the organization can estimate, and the optimal policy is a deterministic threshold rule (Proposition 4) rather than a randomized audit. Audit-selection algorithms in information systems research likewise rely on scores that rank items by estimated risk and, when audited parties respond, add deterrence to the objective (Bouayad et al. 2019); our problem retains the scoring and loses the deterrence. This is both a simplification and a boundary: if users could adapt prompts or workflows in response to known verification practices, the strategic elements of the audit literature would re-enter.</w:t>
       </w:r>
     </w:p>
     <w:bookmarkEnd w:id="42"/>
@@ -6360,6 +6360,30 @@
       </w:r>
       <w:r>
         <w:t xml:space="preserve">54(4):525–540.</w:t>
+      </w:r>
+    </w:p>
+    <w:p>
+      <w:pPr>
+        <w:pStyle w:val="BodyText"/>
+      </w:pPr>
+      <w:r>
+        <w:t xml:space="preserve">Bouayad L, Padmanabhan B, Chari K (2019) Audit policies under the sentinel effect: Deterrence-driven algorithms.</w:t>
+      </w:r>
+      <w:r>
+        <w:t xml:space="preserve"> </w:t>
+      </w:r>
+      <w:r>
+        <w:rPr>
+          <w:iCs/>
+          <w:i/>
+        </w:rPr>
+        <w:t xml:space="preserve">Inform. Systems Res.</w:t>
+      </w:r>
+      <w:r>
+        <w:t xml:space="preserve"> </w:t>
+      </w:r>
+      <w:r>
+        <w:t xml:space="preserve">30(2):466–485.</w:t>
       </w:r>
     </w:p>
     <w:p>

</xml_diff>

<commit_message>
Read Taudien et al. (2026, ISR Just Accepted): cite in Section 8.4, add Prediction 5, read-notes and reference
Co-Authored-By: Claude Sonnet 5.5 <noreply@anthropic.com>
Claude-Session: https://claude.ai/code/session_015MZUD2mugZGFJhoGnpeM66
</commit_message>
<xml_diff>
--- a/halluc/submission/ISR_manuscript.docx
+++ b/halluc/submission/ISR_manuscript.docx
@@ -6130,7 +6130,7 @@
         <w:pStyle w:val="FirstParagraph"/>
       </w:pPr>
       <w:r>
-        <w:t xml:space="preserve">Automating part of verification with another model is an obvious response to the cost problem, and it connects to research on collaboration between people and AI systems, which finds both gains and cognitive pitfalls (Fügener et al. 2021, 2022). Our calibration contributes a specific result. An automated screen is valuable chiefly because it speeds the reviewer’s work, a saving of roughly sixty percent of review time in the study we draw on, and it ceases to be valuable if it reduces the reviewer’s accuracy (Section 7.2 and Table 3). Because people tend to follow machine advice whether or not it is right (Parasuraman and Manzey 2010), the design of the interface through which flags are presented is part of the verification system. Designs that require an independent judgment before the flag is revealed can limit overreliance, although they may cost speed and are rated less favorably by users (Buçinca et al. 2021). Our model suggests where such designs matter most: for units of high predicted risk, where the cost of an accepted false flag or a missed error is largest and where direct human verification may dominate screening.</w:t>
+        <w:t xml:space="preserve">Automating part of verification with another model is an obvious response to the cost problem, and it connects to research on collaboration between people and AI systems, which finds both gains and cognitive pitfalls (Fügener et al. 2021, 2022). Our calibration contributes a specific result. An automated screen is valuable chiefly because it speeds the reviewer’s work, a saving of roughly sixty percent of review time in the study we draw on, and it ceases to be valuable if it reduces the reviewer’s accuracy (Section 7.2 and Table 3). Because people tend to follow machine advice whether or not it is right (Parasuraman and Manzey 2010), the design of the interface through which flags are presented is part of the verification system. Designs that require an independent judgment before the flag is revealed can limit overreliance, although they may cost speed and are rated less favorably by users (Buçinca et al. 2021). Our model suggests where such designs matter most: for units of high predicted risk, where the cost of an accepted false flag or a missed error is largest and where direct human verification may dominate screening. Experimental work on delegation to an image classifier found that a probability-of-correctness signal shown before a decision and feedback on outcomes shown afterwards helped users judge when to rely on the machine only in combination, each alone having no effect or a negative effect on combined performance (Taudien et al. 2026). The authors caution that such signals help only if they reflect actual performance and vary meaningfully across tasks. The analogue in our setting is the predicted risk of a unit, whose usefulness depends on its calibration and on its dispersion (Proposition 2), with the results of earlier checks playing the role of outcome feedback.</w:t>
       </w:r>
     </w:p>
     <w:bookmarkEnd w:id="45"/>
@@ -6257,6 +6257,24 @@
       </w:r>
       <w:r>
         <w:t xml:space="preserve">Verification effort is allocated better by reviewers who see the position within a document than by those who do not, and the effect is larger for tasks in which risk rises toward the end of the text.</w:t>
+      </w:r>
+    </w:p>
+    <w:p>
+      <w:pPr>
+        <w:pStyle w:val="BodyText"/>
+      </w:pPr>
+      <w:r>
+        <w:rPr>
+          <w:iCs/>
+          <w:i/>
+        </w:rPr>
+        <w:t xml:space="preserve">Prediction 5.</w:t>
+      </w:r>
+      <w:r>
+        <w:t xml:space="preserve"> </w:t>
+      </w:r>
+      <w:r>
+        <w:t xml:space="preserve">Showing reviewers the predicted risk of each unit together with the outcomes of their earlier checks improves their allocation of effort more than showing either alone. This extends to verification the finding that certainty and outcome information help users decide when to rely on a machine only in combination (Taudien et al. 2026).</w:t>
       </w:r>
     </w:p>
     <w:p>
@@ -6805,6 +6823,30 @@
       </w:r>
       <w:r>
         <w:t xml:space="preserve">(Association for Computational Linguistics). arXiv:2310.12558. [AUTHORS: complete author list and venue.]</w:t>
+      </w:r>
+    </w:p>
+    <w:p>
+      <w:pPr>
+        <w:pStyle w:val="BodyText"/>
+      </w:pPr>
+      <w:r>
+        <w:t xml:space="preserve">Taudien A, Fügener A, Gupta A, Ketter W (2026) Enhancing AI use: How complementary system information drives delegation frequency and effectiveness.</w:t>
+      </w:r>
+      <w:r>
+        <w:t xml:space="preserve"> </w:t>
+      </w:r>
+      <w:r>
+        <w:rPr>
+          <w:iCs/>
+          <w:i/>
+        </w:rPr>
+        <w:t xml:space="preserve">Inform. Systems Res.</w:t>
+      </w:r>
+      <w:r>
+        <w:t xml:space="preserve"> </w:t>
+      </w:r>
+      <w:r>
+        <w:t xml:space="preserve">Published online ahead of print September 4, https://doi.org/10.1287/isre.2024.1330. [AUTHORS: update volume and pages if the article has appeared in an issue.]</w:t>
       </w:r>
     </w:p>
     <w:p>

</xml_diff>

<commit_message>
Read Jussupow et al. (2026, ISR): cite as a boundary for provenance recording in Section 8.2; add read-notes and reference
Co-Authored-By: Claude Sonnet 5.5 <noreply@anthropic.com>
Claude-Session: https://claude.ai/code/session_015MZUD2mugZGFJhoGnpeM66
</commit_message>
<xml_diff>
--- a/halluc/submission/ISR_manuscript.docx
+++ b/halluc/submission/ISR_manuscript.docx
@@ -5794,6 +5794,14 @@
         <w:t xml:space="preserve">The value of this signal rests on differences in reliability between models, and it falls as those differences shrink. A firm that standardizes on one model forgoes the signal. It then relies on the within-model structure, namely position and, for tasks resting on parametric knowledge, document-level risk.</w:t>
       </w:r>
     </w:p>
+    <w:p>
+      <w:pPr>
+        <w:pStyle w:val="BodyText"/>
+      </w:pPr>
+      <w:r>
+        <w:t xml:space="preserve">Provenance metadata kept to route review should not be confused with labels shown to audiences, because disclosure can change the behavior of those who produce content. In creative work with a text-to-image tool, creators who anticipated that their use of generative AI would be disclosed to an audience largely withdrew from the process and left image generation to the tool; the authors suggest that more nuanced, process-level provenance records, in the manner of content-provenance standards, may mitigate this, and they leave open whether the effect extends to writing and to more technical tasks (Jussupow et al. 2026). Whether recording which model produced a text changes how its authors use the tool is, in our setting, an open question that an experiment would have to answer.</w:t>
+      </w:r>
+    </w:p>
     <w:bookmarkEnd w:id="43"/>
     <w:bookmarkStart w:id="44" w:name="X9227e9307f9fa59f9fdf3f98c104babd1f26c80"/>
     <w:p>
@@ -6634,6 +6642,30 @@
       </w:r>
       <w:r>
         <w:t xml:space="preserve">55(12):Article 248.</w:t>
+      </w:r>
+    </w:p>
+    <w:p>
+      <w:pPr>
+        <w:pStyle w:val="BodyText"/>
+      </w:pPr>
+      <w:r>
+        <w:t xml:space="preserve">Jussupow E, Bauer K, Heigl RM, Vogt B, Hinz O (2026) The indirect disclosure effect: How disclosing generative AI use impacts human creative collaboration with AI.</w:t>
+      </w:r>
+      <w:r>
+        <w:t xml:space="preserve"> </w:t>
+      </w:r>
+      <w:r>
+        <w:rPr>
+          <w:iCs/>
+          <w:i/>
+        </w:rPr>
+        <w:t xml:space="preserve">Inform. Systems Res.</w:t>
+      </w:r>
+      <w:r>
+        <w:t xml:space="preserve"> </w:t>
+      </w:r>
+      <w:r>
+        <w:t xml:space="preserve">Published online ahead of print August 27, https://doi.org/10.1287/isre.2024.0951.</w:t>
       </w:r>
     </w:p>
     <w:p>

</xml_diff>

<commit_message>
Credit Dionne et al. (2009) scoring-based audit rules; refine Section 8.1 and positioning
Co-Authored-By: Claude Sonnet 5.5 <noreply@anthropic.com>
Claude-Session: https://claude.ai/code/session_015MZUD2mugZGFJhoGnpeM66
</commit_message>
<xml_diff>
--- a/halluc/submission/ISR_manuscript.docx
+++ b/halluc/submission/ISR_manuscript.docx
@@ -101,7 +101,7 @@
         <w:pStyle w:val="BodyText"/>
       </w:pPr>
       <w:r>
-        <w:t xml:space="preserve">The third contribution is a decision model. We characterize the cost-minimizing policy as a threshold rule, show that the value of targeting over uniform verification equals the smaller of two totals, and show that adaptive reallocation is valuable only when documents differ in latent difficulty and the budget can be moved across them. The fourth is a calibration of a human-in-the-loop extension with published data on human verification accuracy and time. It shows that an automated screen is valuable mainly because it speeds review, and that its value disappears when it fails to improve the reviewer’s accuracy.</w:t>
+        <w:t xml:space="preserve">The third contribution is a decision model. We characterize the cost-minimizing policy as a threshold rule, which is the no-deterrence counterpart of scoring-based audit rules (Dionne et al. 2009) and is not claimed as new in form, show that the value of targeting over uniform verification equals the smaller of two totals, and show that adaptive reallocation is valuable only when documents differ in latent difficulty and the budget can be moved across them. The fourth is a calibration of a human-in-the-loop extension with published data on human verification accuracy and time. It shows that an automated screen is valuable mainly because it speeds review, and that its value disappears when it fails to improve the reviewer’s accuracy.</w:t>
       </w:r>
     </w:p>
     <w:p>
@@ -191,7 +191,7 @@
         <w:t xml:space="preserve"> </w:t>
       </w:r>
       <w:r>
-        <w:t xml:space="preserve">Research on human–AI collaboration documents that delegating work to AI and reviewing its output involves cognitive challenges and can raise or lower performance depending on the task (Fügener et al. 2021, 2022; Dell’Acqua et al. 2023). The question of how much to verify has an older counterpart in the economics of costly state verification and auditing (Townsend 1979; Gale and Hellwig 1985; Border and Sobel 1987). We bring the second tradition to bear on the first, with the difference that the unit being verified is generated by a stochastic process rather than reported by a strategic agent (Section 8.1). Closely related work audits the behavior of language models before deployment, linking a model’s stated reasoning to its final decisions in economic-game and delegation scenarios (Leng and Yuan 2026). We address a complementary problem: given a model whose outputs contain factual errors, where should scarce human verification go once the model is in use? Audit selection has also been studied as an algorithm-design problem in information systems research: scoring models rank providers or claims by suspicion, and when audited parties respond, the objective is extended to include the deterrence that an audit produces (Bouayad et al. 2019). Our setting has the scoring but, absent retraining on audit outcomes, not the deterrence, because the verified content is produced by a model that does not respond to being checked.</w:t>
+        <w:t xml:space="preserve">Research on human–AI collaboration documents that delegating work to AI and reviewing its output involves cognitive challenges and can raise or lower performance depending on the task (Fügener et al. 2021, 2022; Dell’Acqua et al. 2023). The question of how much to verify has an older counterpart in the economics of costly state verification and auditing (Townsend 1979; Gale and Hellwig 1985; Border and Sobel 1987). We bring the second tradition to bear on the first, with the difference that the unit being verified is generated by a stochastic process rather than reported by a strategic agent (Section 8.1). Closely related work audits the behavior of language models before deployment, linking a model’s stated reasoning to its final decisions in economic-game and delegation scenarios (Leng and Yuan 2026). We address a complementary problem: given a model whose outputs contain factual errors, where should scarce human verification go once the model is in use? Audit selection has also been studied as an algorithm-design problem in information systems research: scoring models rank providers or claims by suspicion, and when audited parties respond, the objective is extended to include the deterrence that an audit produces (Bouayad et al. 2019). Scoring-based audit theory likewise yields threshold rules, including under a budget constraint (Dionne et al. 2009). Our setting has the scoring but, absent retraining on audit outcomes, not the deterrence, because the verified content is produced by a model that does not respond to being checked.</w:t>
       </w:r>
     </w:p>
     <w:p>
@@ -5765,7 +5765,25 @@
         <w:pStyle w:val="FirstParagraph"/>
       </w:pPr>
       <w:r>
-        <w:t xml:space="preserve">Generative AI changes where the cost of producing information lies. The marginal cost of a draft approaches zero, while the cost of establishing that the draft is correct remains with people. The decision studied here, how much of an output to check and which parts, is therefore a management problem that recurs in every deployment, and the budget for checking is a control variable much like an audit budget. The structure of our problem resembles classical theories of costly state verification and auditing (Townsend 1979; Gale and Hellwig 1985; Border and Sobel 1987), in which a principal can observe the true state only by paying to verify it. There is one difference that matters for the form of the optimal policy. In those theories the verified party reports strategically, so optimal verification is typically stochastic and exists to deter misreporting. A language model does not respond strategically to being checked. Its errors arise from a random process whose intensity the organization can estimate, and the optimal policy is a deterministic threshold rule (Proposition 4) rather than a randomized audit. Audit-selection algorithms in information systems research likewise rely on scores that rank items by estimated risk and, when audited parties respond, add deterrence to the objective (Bouayad et al. 2019); our problem retains the scoring and loses the deterrence. This is both a simplification and a boundary: if users could adapt prompts or workflows in response to known verification practices, the strategic elements of the audit literature would re-enter.</w:t>
+        <w:t xml:space="preserve">Generative AI changes where the cost of producing information lies. The marginal cost of a draft approaches zero, while the cost of establishing that the draft is correct remains with people. The decision studied here, how much of an output to check and which parts, is therefore a management problem that recurs in every deployment, and the budget for checking is a control variable much like an audit budget. The structure of our problem resembles classical theories of costly state verification and auditing (Townsend 1979; Gale and Hellwig 1985; Border and Sobel 1987), in which a principal can observe the true state only by paying to verify it. There is one difference that matters for the form of the optimal policy. In those theories the verified party reports strategically, so optimal verification is typically randomized and exists to deter misreporting. When a score of suspicion is available, the optimal audit rule becomes a deterministic</w:t>
+      </w:r>
+      <w:r>
+        <w:t xml:space="preserve"> </w:t>
+      </w:r>
+      <w:r>
+        <w:t xml:space="preserve">“</w:t>
+      </w:r>
+      <w:r>
+        <w:t xml:space="preserve">red flags</w:t>
+      </w:r>
+      <w:r>
+        <w:t xml:space="preserve">”</w:t>
+      </w:r>
+      <w:r>
+        <w:t xml:space="preserve"> </w:t>
+      </w:r>
+      <w:r>
+        <w:t xml:space="preserve">threshold from the auditor’s viewpoint, and deterrence can justify auditing cases whose direct expected gain is negative (Dionne et al. 2009). A language model does not respond strategically to being checked. Its errors arise from a random process whose intensity the organization can estimate, and with no deterrence to produce, the optimal policy is the direct benefit-cost threshold rule (Proposition 4), the counterpart of the scoring-based rule in which every audit must pay for itself. Audit-selection algorithms in information systems research likewise rely on scores that rank items by estimated risk and, when audited parties respond, add deterrence to the objective (Bouayad et al. 2019); our problem retains the scoring and loses the deterrence. This is both a simplification and a boundary: if users could adapt prompts or workflows in response to known verification practices, the strategic elements of the audit literature would re-enter.</w:t>
       </w:r>
     </w:p>
     <w:bookmarkEnd w:id="42"/>
@@ -6474,6 +6492,30 @@
       </w:pPr>
       <w:r>
         <w:t xml:space="preserve">Dell’Acqua F, McFowland E III, Mollick ER, Lifshitz-Assaf H, Kellogg K, Rajendran S, Krayer L, Candelon F, Lakhani KR (2023) Navigating the jagged technological frontier: Field experimental evidence of the effects of AI on knowledge worker productivity and quality. Working paper 24-013, Harvard Business School, Boston.</w:t>
+      </w:r>
+    </w:p>
+    <w:p>
+      <w:pPr>
+        <w:pStyle w:val="BodyText"/>
+      </w:pPr>
+      <w:r>
+        <w:t xml:space="preserve">Dionne G, Giuliano F, Picard P (2009) Optimal auditing with scoring: Theory and application to insurance fraud.</w:t>
+      </w:r>
+      <w:r>
+        <w:t xml:space="preserve"> </w:t>
+      </w:r>
+      <w:r>
+        <w:rPr>
+          <w:iCs/>
+          <w:i/>
+        </w:rPr>
+        <w:t xml:space="preserve">Management Sci.</w:t>
+      </w:r>
+      <w:r>
+        <w:t xml:space="preserve"> </w:t>
+      </w:r>
+      <w:r>
+        <w:t xml:space="preserve">55(1):58–70.</w:t>
       </w:r>
     </w:p>
     <w:p>

</xml_diff>

<commit_message>
Ground Fügener et al. (2022) in Sections 2 and 8.4; add read notes
Co-Authored-By: Claude Sonnet 5.5 <noreply@anthropic.com>
Claude-Session: https://claude.ai/code/session_015MZUD2mugZGFJhoGnpeM66
</commit_message>
<xml_diff>
--- a/halluc/submission/ISR_manuscript.docx
+++ b/halluc/submission/ISR_manuscript.docx
@@ -191,7 +191,7 @@
         <w:t xml:space="preserve"> </w:t>
       </w:r>
       <w:r>
-        <w:t xml:space="preserve">Research on human–AI collaboration documents that delegating work to AI and reviewing its output involves cognitive challenges and can raise or lower performance depending on the task (Fügener et al. 2021, 2022; Dell’Acqua et al. 2023). The question of how much to verify has an older counterpart in the economics of costly state verification and auditing (Townsend 1979; Gale and Hellwig 1985; Border and Sobel 1987). We bring the second tradition to bear on the first, with the difference that the unit being verified is generated by a stochastic process rather than reported by a strategic agent (Section 8.1). Closely related work audits the behavior of language models before deployment, linking a model’s stated reasoning to its final decisions in economic-game and delegation scenarios (Leng and Yuan 2026). We address a complementary problem: given a model whose outputs contain factual errors, where should scarce human verification go once the model is in use? Audit selection has also been studied as an algorithm-design problem in information systems research: scoring models rank providers or claims by suspicion, and when audited parties respond, the objective is extended to include the deterrence that an audit produces (Bouayad et al. 2019). Scoring-based audit theory likewise yields threshold rules, including under a budget constraint (Dionne et al. 2009). Our setting has the scoring but, absent retraining on audit outcomes, not the deterrence, because the verified content is produced by a model that does not respond to being checked.</w:t>
+        <w:t xml:space="preserve">Research on human–AI collaboration documents that delegating work to AI and reviewing its output involves cognitive challenges and can raise or lower performance depending on the task (Fügener et al. 2021, 2022; Dell’Acqua et al. 2023). In image-classification experiments, an AI that delegated uncertain cases to people improved on the AI alone, whereas people who delegated to the AI did not, because they could not judge accurately which cases they would get wrong (Fügener et al. 2022). The question of how much to verify has an older counterpart in the economics of costly state verification and auditing (Townsend 1979; Gale and Hellwig 1985; Border and Sobel 1987). We bring the second tradition to bear on the first, with the difference that the unit being verified is generated by a stochastic process rather than reported by a strategic agent (Section 8.1). Closely related work audits the behavior of language models before deployment, linking a model’s stated reasoning to its final decisions in economic-game and delegation scenarios (Leng and Yuan 2026). We address a complementary problem: given a model whose outputs contain factual errors, where should scarce human verification go once the model is in use? Audit selection has also been studied as an algorithm-design problem in information systems research: scoring models rank providers or claims by suspicion, and when audited parties respond, the objective is extended to include the deterrence that an audit produces (Bouayad et al. 2019). Scoring-based audit theory likewise yields threshold rules, including under a budget constraint (Dionne et al. 2009). Our setting has the scoring but, absent retraining on audit outcomes, not the deterrence, because the verified content is produced by a model that does not respond to being checked.</w:t>
       </w:r>
     </w:p>
     <w:p>
@@ -6156,7 +6156,7 @@
         <w:pStyle w:val="FirstParagraph"/>
       </w:pPr>
       <w:r>
-        <w:t xml:space="preserve">Automating part of verification with another model is an obvious response to the cost problem, and it connects to research on collaboration between people and AI systems, which finds both gains and cognitive pitfalls (Fügener et al. 2021, 2022). Our calibration contributes a specific result. An automated screen is valuable chiefly because it speeds the reviewer’s work, a saving of roughly sixty percent of review time in the study we draw on, and it ceases to be valuable if it reduces the reviewer’s accuracy (Section 7.2 and Table 3). Because people tend to follow machine advice whether or not it is right (Parasuraman and Manzey 2010), the design of the interface through which flags are presented is part of the verification system. Designs that require an independent judgment before the flag is revealed can limit overreliance, although they may cost speed and are rated less favorably by users (Buçinca et al. 2021). Our model suggests where such designs matter most: for units of high predicted risk, where the cost of an accepted false flag or a missed error is largest and where direct human verification may dominate screening. Experimental work on delegation to an image classifier found that a probability-of-correctness signal shown before a decision and feedback on outcomes shown afterwards helped users judge when to rely on the machine only in combination, each alone having no effect or a negative effect on combined performance (Taudien et al. 2026). The authors caution that such signals help only if they reflect actual performance and vary meaningfully across tasks. The analogue in our setting is the predicted risk of a unit, whose usefulness depends on its calibration and on its dispersion (Proposition 2), with the results of earlier checks playing the role of outcome feedback.</w:t>
+        <w:t xml:space="preserve">Automating part of verification with another model is an obvious response to the cost problem, and it connects to research on collaboration between people and AI systems, which finds both gains and cognitive pitfalls (Fügener et al. 2021, 2022). Our calibration contributes a specific result. An automated screen is valuable chiefly because it speeds the reviewer’s work, a saving of roughly sixty percent of review time in the study we draw on, and it ceases to be valuable if it reduces the reviewer’s accuracy (Section 7.2 and Table 3). Because people tend to follow machine advice whether or not it is right (Parasuraman and Manzey 2010), the design of the interface through which flags are presented is part of the verification system. Designs that require an independent judgment before the flag is revealed can limit overreliance, although they may cost speed and are rated less favorably by users (Buçinca et al. 2021). Our model suggests where such designs matter most: for units of high predicted risk, where the cost of an accepted false flag or a missed error is largest and where direct human verification may dominate screening. Evidence on the limits of self-assessment points the same way: in image-classification experiments, people who chose which cases to delegate to an AI did not improve on working alone, because they misjudged which cases they would classify wrongly (Fügener et al. 2022). This supports routing review by externally recorded signals such as the generating model rather than by the reviewer’s own sense of where errors lie, although those experiments concerned image classification, not checking generated text, and we have no direct test. Experimental work on delegation to an image classifier found that a probability-of-correctness signal shown before a decision and feedback on outcomes shown afterwards helped users judge when to rely on the machine only in combination, each alone having no effect or a negative effect on combined performance (Taudien et al. 2026). The authors caution that such signals help only if they reflect actual performance and vary meaningfully across tasks. The analogue in our setting is the predicted risk of a unit, whose usefulness depends on its calibration and on its dispersion (Proposition 2), with the results of earlier checks playing the role of outcome feedback.</w:t>
       </w:r>
     </w:p>
     <w:bookmarkEnd w:id="45"/>

</xml_diff>

<commit_message>
Add Bauer et al. (2023) to Section 8.4 with read notes
Co-Authored-By: Claude Sonnet 5.5 <noreply@anthropic.com>
Claude-Session: https://claude.ai/code/session_015MZUD2mugZGFJhoGnpeM66
</commit_message>
<xml_diff>
--- a/halluc/submission/ISR_manuscript.docx
+++ b/halluc/submission/ISR_manuscript.docx
@@ -6156,7 +6156,7 @@
         <w:pStyle w:val="FirstParagraph"/>
       </w:pPr>
       <w:r>
-        <w:t xml:space="preserve">Automating part of verification with another model is an obvious response to the cost problem, and it connects to research on collaboration between people and AI systems, which finds both gains and cognitive pitfalls (Fügener et al. 2021, 2022). Our calibration contributes a specific result. An automated screen is valuable chiefly because it speeds the reviewer’s work, a saving of roughly sixty percent of review time in the study we draw on, and it ceases to be valuable if it reduces the reviewer’s accuracy (Section 7.2 and Table 3). Because people tend to follow machine advice whether or not it is right (Parasuraman and Manzey 2010), the design of the interface through which flags are presented is part of the verification system. Designs that require an independent judgment before the flag is revealed can limit overreliance, although they may cost speed and are rated less favorably by users (Buçinca et al. 2021). Our model suggests where such designs matter most: for units of high predicted risk, where the cost of an accepted false flag or a missed error is largest and where direct human verification may dominate screening. Evidence on the limits of self-assessment points the same way: in image-classification experiments, people who chose which cases to delegate to an AI did not improve on working alone, because they misjudged which cases they would classify wrongly (Fügener et al. 2022). This supports routing review by externally recorded signals such as the generating model rather than by the reviewer’s own sense of where errors lie, although those experiments concerned image classification, not checking generated text, and we have no direct test. Experimental work on delegation to an image classifier found that a probability-of-correctness signal shown before a decision and feedback on outcomes shown afterwards helped users judge when to rely on the machine only in combination, each alone having no effect or a negative effect on combined performance (Taudien et al. 2026). The authors caution that such signals help only if they reflect actual performance and vary meaningfully across tasks. The analogue in our setting is the predicted risk of a unit, whose usefulness depends on its calibration and on its dispersion (Proposition 2), with the results of earlier checks playing the role of outcome feedback.</w:t>
+        <w:t xml:space="preserve">Automating part of verification with another model is an obvious response to the cost problem, and it connects to research on collaboration between people and AI systems, which finds both gains and cognitive pitfalls (Fügener et al. 2021, 2022). Our calibration contributes a specific result. An automated screen is valuable chiefly because it speeds the reviewer’s work, a saving of roughly sixty percent of review time in the study we draw on, and it ceases to be valuable if it reduces the reviewer’s accuracy (Section 7.2 and Table 3). Because people tend to follow machine advice whether or not it is right (Parasuraman and Manzey 2010), the design of the interface through which flags are presented is part of the verification system. Designs that require an independent judgment before the flag is revealed can limit overreliance, although they may cost speed and are rated less favorably by users (Buçinca et al. 2021). Explanations attached to a flag are not neutral either: in two experiments with a prediction task, feature-based explanations changed how users weighted information and lowered the investment performance of laypeople relative to opaque predictions, with users updating more toward explanations that confirmed their prior beliefs (Bauer et al. 2023). Those tasks were numerical prediction, not review of generated text, so we treat the result as a reason to test, not to assume, that adding explanations to flags helps reviewers. Our model suggests where such designs matter most: for units of high predicted risk, where the cost of an accepted false flag or a missed error is largest and where direct human verification may dominate screening. Evidence on the limits of self-assessment points the same way: in image-classification experiments, people who chose which cases to delegate to an AI did not improve on working alone, because they misjudged which cases they would classify wrongly (Fügener et al. 2022). This supports routing review by externally recorded signals such as the generating model rather than by the reviewer’s own sense of where errors lie, although those experiments concerned image classification, not checking generated text, and we have no direct test. Experimental work on delegation to an image classifier found that a probability-of-correctness signal shown before a decision and feedback on outcomes shown afterwards helped users judge when to rely on the machine only in combination, each alone having no effect or a negative effect on combined performance (Taudien et al. 2026). The authors caution that such signals help only if they reflect actual performance and vary meaningfully across tasks. The analogue in our setting is the predicted risk of a unit, whose usefulness depends on its calibration and on its dispersion (Proposition 2), with the results of earlier checks playing the role of outcome feedback.</w:t>
       </w:r>
     </w:p>
     <w:bookmarkEnd w:id="45"/>
@@ -6380,6 +6380,30 @@
       </w:pPr>
       <w:r>
         <w:t xml:space="preserve">[AUTHORS: every entry must be verified against the original source. Format follows the pattern of reference lists in published ISR articles (surname and initials, year in parentheses, abbreviated journal names); the official INFORMS reference-style guide has not been read, so abbreviations may need adjustment.]</w:t>
+      </w:r>
+    </w:p>
+    <w:p>
+      <w:pPr>
+        <w:pStyle w:val="BodyText"/>
+      </w:pPr>
+      <w:r>
+        <w:t xml:space="preserve">Bauer K, von Zahn M, Hinz O (2023) Expl(AI)ned: The impact of explainable artificial intelligence on users’ information processing.</w:t>
+      </w:r>
+      <w:r>
+        <w:t xml:space="preserve"> </w:t>
+      </w:r>
+      <w:r>
+        <w:rPr>
+          <w:iCs/>
+          <w:i/>
+        </w:rPr>
+        <w:t xml:space="preserve">Inform. Systems Res.</w:t>
+      </w:r>
+      <w:r>
+        <w:t xml:space="preserve"> </w:t>
+      </w:r>
+      <w:r>
+        <w:t xml:space="preserve">34(4):1582–1602.</w:t>
       </w:r>
     </w:p>
     <w:p>

</xml_diff>

<commit_message>
Cite Baird and Maruping (2021) in Section 2 with read notes
Co-Authored-By: Claude Sonnet 5.5 <noreply@anthropic.com>
Claude-Session: https://claude.ai/code/session_015MZUD2mugZGFJhoGnpeM66
</commit_message>
<xml_diff>
--- a/halluc/submission/ISR_manuscript.docx
+++ b/halluc/submission/ISR_manuscript.docx
@@ -191,7 +191,7 @@
         <w:t xml:space="preserve"> </w:t>
       </w:r>
       <w:r>
-        <w:t xml:space="preserve">Research on human–AI collaboration documents that delegating work to AI and reviewing its output involves cognitive challenges and can raise or lower performance depending on the task (Fügener et al. 2021, 2022; Dell’Acqua et al. 2023). In image-classification experiments, an AI that delegated uncertain cases to people improved on the AI alone, whereas people who delegated to the AI did not, because they could not judge accurately which cases they would get wrong (Fügener et al. 2022). The question of how much to verify has an older counterpart in the economics of costly state verification and auditing (Townsend 1979; Gale and Hellwig 1985; Border and Sobel 1987). We bring the second tradition to bear on the first, with the difference that the unit being verified is generated by a stochastic process rather than reported by a strategic agent (Section 8.1). Closely related work audits the behavior of language models before deployment, linking a model’s stated reasoning to its final decisions in economic-game and delegation scenarios (Leng and Yuan 2026). We address a complementary problem: given a model whose outputs contain factual errors, where should scarce human verification go once the model is in use? Audit selection has also been studied as an algorithm-design problem in information systems research: scoring models rank providers or claims by suspicion, and when audited parties respond, the objective is extended to include the deterrence that an audit produces (Bouayad et al. 2019). Scoring-based audit theory likewise yields threshold rules, including under a budget constraint (Dionne et al. 2009). Our setting has the scoring but, absent retraining on audit outcomes, not the deterrence, because the verified content is produced by a model that does not respond to being checked.</w:t>
+        <w:t xml:space="preserve">Research on human–AI collaboration documents that delegating work to AI and reviewing its output involves cognitive challenges and can raise or lower performance depending on the task (Fügener et al. 2021, 2022; Dell’Acqua et al. 2023). In image-classification experiments, an AI that delegated uncertain cases to people improved on the AI alone, whereas people who delegated to the AI did not, because they could not judge accurately which cases they would get wrong (Fügener et al. 2022). Baird and Maruping (2021) argue that IS use research should treat information systems as agents to which people delegate tasks and responsibilities, and they name monitoring and accountability among the mechanisms that coordinate such delegation. Deciding how much of a model’s output to check is a monitoring decision of this kind, which their framework does not analyze quantitatively. The question of how much to verify has an older counterpart in the economics of costly state verification and auditing (Townsend 1979; Gale and Hellwig 1985; Border and Sobel 1987). We bring the second tradition to bear on the first, with the difference that the unit being verified is generated by a stochastic process rather than reported by a strategic agent (Section 8.1). Closely related work audits the behavior of language models before deployment, linking a model’s stated reasoning to its final decisions in economic-game and delegation scenarios (Leng and Yuan 2026). We address a complementary problem: given a model whose outputs contain factual errors, where should scarce human verification go once the model is in use? Audit selection has also been studied as an algorithm-design problem in information systems research: scoring models rank providers or claims by suspicion, and when audited parties respond, the objective is extended to include the deterrence that an audit produces (Bouayad et al. 2019). Scoring-based audit theory likewise yields threshold rules, including under a budget constraint (Dionne et al. 2009). Our setting has the scoring but, absent retraining on audit outcomes, not the deterrence, because the verified content is produced by a model that does not respond to being checked.</w:t>
       </w:r>
     </w:p>
     <w:p>
@@ -6380,6 +6380,30 @@
       </w:pPr>
       <w:r>
         <w:t xml:space="preserve">[AUTHORS: every entry must be verified against the original source. Format follows the pattern of reference lists in published ISR articles (surname and initials, year in parentheses, abbreviated journal names); the official INFORMS reference-style guide has not been read, so abbreviations may need adjustment.]</w:t>
+      </w:r>
+    </w:p>
+    <w:p>
+      <w:pPr>
+        <w:pStyle w:val="BodyText"/>
+      </w:pPr>
+      <w:r>
+        <w:t xml:space="preserve">Baird A, Maruping LM (2021) The next generation of research on IS use: A theoretical framework of delegation to and from agentic IS artifacts.</w:t>
+      </w:r>
+      <w:r>
+        <w:t xml:space="preserve"> </w:t>
+      </w:r>
+      <w:r>
+        <w:rPr>
+          <w:iCs/>
+          <w:i/>
+        </w:rPr>
+        <w:t xml:space="preserve">MIS Quart.</w:t>
+      </w:r>
+      <w:r>
+        <w:t xml:space="preserve"> </w:t>
+      </w:r>
+      <w:r>
+        <w:t xml:space="preserve">45(1):315–341.</w:t>
       </w:r>
     </w:p>
     <w:p>

</xml_diff>

<commit_message>
Cite Berente et al. (2021) in Section 2 with read notes
Co-Authored-By: Claude Sonnet 5.5 <noreply@anthropic.com>
Claude-Session: https://claude.ai/code/session_015MZUD2mugZGFJhoGnpeM66
</commit_message>
<xml_diff>
--- a/halluc/submission/ISR_manuscript.docx
+++ b/halluc/submission/ISR_manuscript.docx
@@ -191,7 +191,7 @@
         <w:t xml:space="preserve"> </w:t>
       </w:r>
       <w:r>
-        <w:t xml:space="preserve">Research on human–AI collaboration documents that delegating work to AI and reviewing its output involves cognitive challenges and can raise or lower performance depending on the task (Fügener et al. 2021, 2022; Dell’Acqua et al. 2023). In image-classification experiments, an AI that delegated uncertain cases to people improved on the AI alone, whereas people who delegated to the AI did not, because they could not judge accurately which cases they would get wrong (Fügener et al. 2022). Baird and Maruping (2021) argue that IS use research should treat information systems as agents to which people delegate tasks and responsibilities, and they name monitoring and accountability among the mechanisms that coordinate such delegation. Deciding how much of a model’s output to check is a monitoring decision of this kind, which their framework does not analyze quantitatively. The question of how much to verify has an older counterpart in the economics of costly state verification and auditing (Townsend 1979; Gale and Hellwig 1985; Border and Sobel 1987). We bring the second tradition to bear on the first, with the difference that the unit being verified is generated by a stochastic process rather than reported by a strategic agent (Section 8.1). Closely related work audits the behavior of language models before deployment, linking a model’s stated reasoning to its final decisions in economic-game and delegation scenarios (Leng and Yuan 2026). We address a complementary problem: given a model whose outputs contain factual errors, where should scarce human verification go once the model is in use? Audit selection has also been studied as an algorithm-design problem in information systems research: scoring models rank providers or claims by suspicion, and when audited parties respond, the objective is extended to include the deterrence that an audit produces (Bouayad et al. 2019). Scoring-based audit theory likewise yields threshold rules, including under a budget constraint (Dionne et al. 2009). Our setting has the scoring but, absent retraining on audit outcomes, not the deterrence, because the verified content is produced by a model that does not respond to being checked.</w:t>
+        <w:t xml:space="preserve">Research on human–AI collaboration documents that delegating work to AI and reviewing its output involves cognitive challenges and can raise or lower performance depending on the task (Fügener et al. 2021, 2022; Dell’Acqua et al. 2023). In image-classification experiments, an AI that delegated uncertain cases to people improved on the AI alone, whereas people who delegated to the AI did not, because they could not judge accurately which cases they would get wrong (Fügener et al. 2022). Baird and Maruping (2021) argue that IS use research should treat information systems as agents to which people delegate tasks and responsibilities, and they name monitoring and accountability among the mechanisms that coordinate such delegation. Deciding how much of a model’s output to check is a monitoring decision of this kind, which their framework does not analyze quantitatively. Berente et al. (2021) frame the management of AI around three facets, autonomy, learning, and inscrutability, and note that oversight and augmentation are proposed responses to problems that arise when AI generates its own knowledge; they do not address how to size or target such oversight. The question of how much to verify has an older counterpart in the economics of costly state verification and auditing (Townsend 1979; Gale and Hellwig 1985; Border and Sobel 1987). We bring the second tradition to bear on the first, with the difference that the unit being verified is generated by a stochastic process rather than reported by a strategic agent (Section 8.1). Closely related work audits the behavior of language models before deployment, linking a model’s stated reasoning to its final decisions in economic-game and delegation scenarios (Leng and Yuan 2026). We address a complementary problem: given a model whose outputs contain factual errors, where should scarce human verification go once the model is in use? Audit selection has also been studied as an algorithm-design problem in information systems research: scoring models rank providers or claims by suspicion, and when audited parties respond, the objective is extended to include the deterrence that an audit produces (Bouayad et al. 2019). Scoring-based audit theory likewise yields threshold rules, including under a budget constraint (Dionne et al. 2009). Our setting has the scoring but, absent retraining on audit outcomes, not the deterrence, because the verified content is produced by a model that does not respond to being checked.</w:t>
       </w:r>
     </w:p>
     <w:p>
@@ -6428,6 +6428,30 @@
       </w:r>
       <w:r>
         <w:t xml:space="preserve">34(4):1582–1602.</w:t>
+      </w:r>
+    </w:p>
+    <w:p>
+      <w:pPr>
+        <w:pStyle w:val="BodyText"/>
+      </w:pPr>
+      <w:r>
+        <w:t xml:space="preserve">Berente N, Gu B, Recker J, Santhanam R (2021) Managing artificial intelligence.</w:t>
+      </w:r>
+      <w:r>
+        <w:t xml:space="preserve"> </w:t>
+      </w:r>
+      <w:r>
+        <w:rPr>
+          <w:iCs/>
+          <w:i/>
+        </w:rPr>
+        <w:t xml:space="preserve">MIS Quart.</w:t>
+      </w:r>
+      <w:r>
+        <w:t xml:space="preserve"> </w:t>
+      </w:r>
+      <w:r>
+        <w:t xml:space="preserve">45(3):1433–1450.</w:t>
       </w:r>
     </w:p>
     <w:p>

</xml_diff>